<commit_message>
docs(tcc): redige objetivo geral e objetivos especificos (1.2)
- objetivo geral e seis objetivos especificos em alineas (a a f)
- alineas com recuo proprio, minusculas e ponto e virgula, conforme NBR 6024
- gerador passa a suportar a etiqueta [a] para alineas

Co-authored-by: arena-agent <297053741+arena-agent@users.noreply.github.com>
</commit_message>
<xml_diff>
--- a/docs/tcc/TCC-Vida+.docx
+++ b/docs/tcc/TCC-Vida+.docx
@@ -3464,6 +3464,16 @@
       </w:r>
     </w:p>
     <w:p>
+      <w:r>
+        <w:rPr>
+          <w:rFonts w:ascii="Arial" w:hAnsi="Arial" w:cs="Arial" w:eastAsia="Arial"/>
+          <w:color w:val="000000"/>
+          <w:sz w:val="24"/>
+        </w:rPr>
+        <w:t>A seguir são apresentados o objetivo geral e os objetivos específicos desta pesquisa.</w:t>
+      </w:r>
+    </w:p>
+    <w:p>
       <w:pPr>
         <w:pStyle w:val="Heading3"/>
       </w:pPr>
@@ -3483,7 +3493,7 @@
           <w:color w:val="000000"/>
           <w:sz w:val="24"/>
         </w:rPr>
-        <w:t>Desenvolver um sistema de saúde digital integrado, denominado Vida+, capaz de acompanhar o atendimento do paciente na atenção primária desde a recepção até a entrega do resultado da consulta, integrando recepção, triagem, atendimento médico, sala de espera e o próprio paciente por meio de um banco de dados único e em tempo real.</w:t>
+        <w:t>Desenvolver um sistema de saúde digital integrado, denominado Vida+, capaz de acompanhar o atendimento do paciente na atenção primária desde a recepção até a entrega do resultado da consulta, integrando as equipes de recepção, de triagem e de atendimento médico, o painel de chamadas da sala de espera e o próprio paciente por meio de um único banco de dados com atualização em tempo real.</w:t>
       </w:r>
     </w:p>
     <w:p>
@@ -3500,81 +3510,93 @@
       </w:r>
     </w:p>
     <w:p>
+      <w:pPr>
+        <w:spacing w:line="360" w:lineRule="auto"/>
+        <w:ind w:firstLine="0" w:left="709"/>
+        <w:jc w:val="both"/>
+      </w:pPr>
       <w:r>
         <w:rPr>
           <w:rFonts w:ascii="Arial" w:hAnsi="Arial" w:cs="Arial" w:eastAsia="Arial"/>
           <w:color w:val="000000"/>
           <w:sz w:val="24"/>
         </w:rPr>
-        <w:t xml:space="preserve">a) </w:t>
-      </w:r>
-      <w:r>
-        <w:rPr>
-          <w:rFonts w:ascii="Arial" w:hAnsi="Arial" w:cs="Arial" w:eastAsia="Arial"/>
-          <w:i/>
-          <w:color w:val="C00000"/>
-          <w:sz w:val="24"/>
-        </w:rPr>
-        <w:t>analisar os processos de recepção, triagem e atendimento médico de uma unidade de saúde;</w:t>
+        <w:t>a) analisar o fluxo de atendimento de uma unidade de atenção primária, identificando os pontos de espera, de retrabalho e de perda de informação entre a recepção, a triagem e a consulta médica;</w:t>
       </w:r>
     </w:p>
     <w:p>
+      <w:pPr>
+        <w:spacing w:line="360" w:lineRule="auto"/>
+        <w:ind w:firstLine="0" w:left="709"/>
+        <w:jc w:val="both"/>
+      </w:pPr>
       <w:r>
         <w:rPr>
           <w:rFonts w:ascii="Arial" w:hAnsi="Arial" w:cs="Arial" w:eastAsia="Arial"/>
           <w:color w:val="000000"/>
           <w:sz w:val="24"/>
         </w:rPr>
-        <w:t>b) modelar um banco de dados relacional que centralize pacientes, usuários, unidades de saúde, consultas, agendamentos, notificações, medicamentos e configurações;</w:t>
+        <w:t>b) modelar e implementar um banco de dados relacional único, capaz de centralizar o cadastro de pacientes e de profissionais, as consultas, os agendamentos, as notificações, o controle de medicamentos e as configurações do sistema;</w:t>
       </w:r>
     </w:p>
     <w:p>
+      <w:pPr>
+        <w:spacing w:line="360" w:lineRule="auto"/>
+        <w:ind w:firstLine="0" w:left="709"/>
+        <w:jc w:val="both"/>
+      </w:pPr>
       <w:r>
         <w:rPr>
           <w:rFonts w:ascii="Arial" w:hAnsi="Arial" w:cs="Arial" w:eastAsia="Arial"/>
           <w:color w:val="000000"/>
           <w:sz w:val="24"/>
         </w:rPr>
-        <w:t>c) desenvolver os painéis de uso da equipe de saúde para administrador, médico, enfermeiro e recepcionista;</w:t>
+        <w:t>c) desenvolver os painéis de uso da equipe de saúde, contemplando as funções de recepcionista, enfermeiro, médico e administrador, com o cadastro de pacientes, a geração de senhas, a triagem com registro de sinais vitais e classificação de risco, o prontuário, a prescrição de medicamentos e a solicitação de exames;</w:t>
       </w:r>
     </w:p>
     <w:p>
+      <w:pPr>
+        <w:spacing w:line="360" w:lineRule="auto"/>
+        <w:ind w:firstLine="0" w:left="709"/>
+        <w:jc w:val="both"/>
+      </w:pPr>
       <w:r>
         <w:rPr>
           <w:rFonts w:ascii="Arial" w:hAnsi="Arial" w:cs="Arial" w:eastAsia="Arial"/>
           <w:color w:val="000000"/>
           <w:sz w:val="24"/>
         </w:rPr>
-        <w:t>d) desenvolver um aplicativo instalável (PWA) para o paciente acompanhar a fila, o histórico, os exames e os agendamentos;</w:t>
+        <w:t>d) desenvolver um aplicativo instalável no celular, no formato de aplicação web progressiva, para que o paciente acompanhe a posição na fila em tempo real, receba notificações das chamadas e da liberação de resultados e consulte o seu histórico de atendimentos, exames e agendamentos;</w:t>
       </w:r>
     </w:p>
     <w:p>
+      <w:pPr>
+        <w:spacing w:line="360" w:lineRule="auto"/>
+        <w:ind w:firstLine="0" w:left="709"/>
+        <w:jc w:val="both"/>
+      </w:pPr>
       <w:r>
         <w:rPr>
           <w:rFonts w:ascii="Arial" w:hAnsi="Arial" w:cs="Arial" w:eastAsia="Arial"/>
           <w:color w:val="000000"/>
           <w:sz w:val="24"/>
         </w:rPr>
-        <w:t>e) desenvolver o painel de chamada para o telão da sala de espera, integrado em tempo real à fila de atendimento;</w:t>
+        <w:t>e) implementar o painel de chamada exibido no telão da sala de espera, integrado à fila de atendimento, com a apresentação da senha, do nome e do local de destino do paciente e a emissão de aviso sonoro;</w:t>
       </w:r>
     </w:p>
     <w:p>
+      <w:pPr>
+        <w:spacing w:line="360" w:lineRule="auto"/>
+        <w:ind w:firstLine="0" w:left="709"/>
+        <w:jc w:val="both"/>
+      </w:pPr>
       <w:r>
         <w:rPr>
           <w:rFonts w:ascii="Arial" w:hAnsi="Arial" w:cs="Arial" w:eastAsia="Arial"/>
           <w:color w:val="000000"/>
           <w:sz w:val="24"/>
         </w:rPr>
-        <w:t xml:space="preserve">f) </w:t>
-      </w:r>
-      <w:r>
-        <w:rPr>
-          <w:rFonts w:ascii="Arial" w:hAnsi="Arial" w:cs="Arial" w:eastAsia="Arial"/>
-          <w:i/>
-          <w:color w:val="C00000"/>
-          <w:sz w:val="24"/>
-        </w:rPr>
-        <w:t>validar o sistema por meio de testes funcionais e de uma demonstração assistida com usuários.</w:t>
+        <w:t>f) avaliar o sistema desenvolvido por meio de testes funcionais por perfil de usuário, verificando o atendimento aos requisitos levantados e a sincronização das informações entre os módulos.</w:t>
       </w:r>
     </w:p>
     <w:p>

</xml_diff>